<commit_message>
feat(hito1): integrar mockups movil y preparar Hito1_LeadCraft_Kevin para entrega
</commit_message>
<xml_diff>
--- a/Proyecto intermodular/Hito1/Hito1_Viabilidad_LeadCraft_Kevin.docx
+++ b/Proyecto intermodular/Hito1/Hito1_Viabilidad_LeadCraft_Kevin.docx
@@ -4,12 +4,12 @@
   <w:body>
     <w:p>
       <w:pPr>
-        <w:spacing w:before="500"/>
+        <w:spacing w:before="400"/>
       </w:pPr>
     </w:p>
     <w:p>
       <w:pPr>
-        <w:spacing w:after="120"/>
+        <w:spacing w:after="80"/>
         <w:jc w:val="center"/>
       </w:pPr>
       <w:r>
@@ -17,7 +17,7 @@
           <w:rFonts w:ascii="Calibri" w:hAnsi="Calibri"/>
           <w:b/>
           <w:color w:val="00B496"/>
-          <w:sz w:val="22"/>
+          <w:sz w:val="21"/>
         </w:rPr>
         <w:t>PROYECTO INTERMODULAR • 2º DAM</w:t>
       </w:r>
@@ -32,14 +32,14 @@
           <w:rFonts w:ascii="Calibri" w:hAnsi="Calibri"/>
           <w:b/>
           <w:color w:val="0A192F"/>
-          <w:sz w:val="60"/>
+          <w:sz w:val="56"/>
         </w:rPr>
         <w:t>LeadCraft AI</w:t>
       </w:r>
     </w:p>
     <w:p>
       <w:pPr>
-        <w:spacing w:after="240" w:line="288" w:lineRule="auto"/>
+        <w:spacing w:after="200" w:line="288" w:lineRule="auto"/>
         <w:jc w:val="center"/>
       </w:pPr>
       <w:r>
@@ -47,14 +47,14 @@
           <w:rFonts w:ascii="Calibri" w:hAnsi="Calibri"/>
           <w:i/>
           <w:color w:val="0038FF"/>
-          <w:sz w:val="25"/>
+          <w:sz w:val="24"/>
         </w:rPr>
         <w:t>Servicio Integral de Gestión y Presencia Digital para el Pequeño Comercio Local impulsado por Inteligencia Artificial</w:t>
       </w:r>
     </w:p>
     <w:p>
       <w:pPr>
-        <w:spacing w:after="240"/>
+        <w:spacing w:after="200"/>
         <w:jc w:val="center"/>
       </w:pPr>
       <w:r>
@@ -66,7 +66,7 @@
     </w:p>
     <w:p>
       <w:pPr>
-        <w:spacing w:after="600" w:line="300" w:lineRule="auto"/>
+        <w:spacing w:after="500" w:line="300" w:lineRule="auto"/>
         <w:jc w:val="center"/>
       </w:pPr>
       <w:r>
@@ -74,7 +74,7 @@
           <w:rFonts w:ascii="Calibri" w:hAnsi="Calibri"/>
           <w:b/>
           <w:color w:val="475569"/>
-          <w:sz w:val="23"/>
+          <w:sz w:val="22"/>
         </w:rPr>
         <w:t>HITO 1: ANÁLISIS Y CONTEXTO</w:t>
         <w:br/>
@@ -83,7 +83,7 @@
     </w:p>
     <w:p>
       <w:pPr>
-        <w:spacing w:line="312" w:lineRule="auto" w:after="700"/>
+        <w:spacing w:line="312" w:lineRule="auto" w:after="560"/>
         <w:jc w:val="center"/>
       </w:pPr>
       <w:r>
@@ -129,14 +129,14 @@
     <w:p>
       <w:pPr>
         <w:keepNext/>
-        <w:spacing w:before="160" w:after="80"/>
+        <w:spacing w:before="120" w:after="60"/>
       </w:pPr>
       <w:r>
         <w:rPr>
           <w:rFonts w:ascii="Calibri" w:hAnsi="Calibri"/>
           <w:b/>
           <w:color w:val="0A192F"/>
-          <w:sz w:val="26"/>
+          <w:sz w:val="25"/>
         </w:rPr>
         <w:t>Índice del Documento de Viabilidad Inicial</w:t>
       </w:r>
@@ -149,7 +149,7 @@
         <w:rPr>
           <w:rFonts w:ascii="Calibri" w:hAnsi="Calibri"/>
           <w:color w:val="1E293B"/>
-          <w:sz w:val="20"/>
+          <w:sz w:val="19"/>
         </w:rPr>
         <w:t>• 01. Título y Descripción del Proyecto: El Servicio LeadCraft AI (Pág. 2)</w:t>
       </w:r>
@@ -162,7 +162,7 @@
         <w:rPr>
           <w:rFonts w:ascii="Calibri" w:hAnsi="Calibri"/>
           <w:color w:val="1E293B"/>
-          <w:sz w:val="20"/>
+          <w:sz w:val="19"/>
         </w:rPr>
         <w:t>• 02. Problema o Necesidad: La Dificultad de Llevar un Negocio en Internet (Pág. 2)</w:t>
       </w:r>
@@ -175,7 +175,7 @@
         <w:rPr>
           <w:rFonts w:ascii="Calibri" w:hAnsi="Calibri"/>
           <w:color w:val="1E293B"/>
-          <w:sz w:val="20"/>
+          <w:sz w:val="19"/>
         </w:rPr>
         <w:t>• 03. Usuarios y Público Objetivo (Pág. 2)</w:t>
       </w:r>
@@ -188,7 +188,7 @@
         <w:rPr>
           <w:rFonts w:ascii="Calibri" w:hAnsi="Calibri"/>
           <w:color w:val="1E293B"/>
-          <w:sz w:val="20"/>
+          <w:sz w:val="19"/>
         </w:rPr>
         <w:t>• 04. Benchmarking Competitivo y Soluciones Similares (Pág. 2)</w:t>
       </w:r>
@@ -201,7 +201,7 @@
         <w:rPr>
           <w:rFonts w:ascii="Calibri" w:hAnsi="Calibri"/>
           <w:color w:val="1E293B"/>
-          <w:sz w:val="20"/>
+          <w:sz w:val="19"/>
         </w:rPr>
         <w:t>• 05. Objetivos Iniciales del Proyecto (Modelo SMART) (Pág. 3)</w:t>
       </w:r>
@@ -214,7 +214,7 @@
         <w:rPr>
           <w:rFonts w:ascii="Calibri" w:hAnsi="Calibri"/>
           <w:color w:val="1E293B"/>
-          <w:sz w:val="20"/>
+          <w:sz w:val="19"/>
         </w:rPr>
         <w:t>• 06. Alcance Mínimo Viable (MVP) y Ampliaciones Futuras (Pág. 3)</w:t>
       </w:r>
@@ -227,7 +227,7 @@
         <w:rPr>
           <w:rFonts w:ascii="Calibri" w:hAnsi="Calibri"/>
           <w:color w:val="1E293B"/>
-          <w:sz w:val="20"/>
+          <w:sz w:val="19"/>
         </w:rPr>
         <w:t>• 07. Riesgos Iniciales y Medidas Preventivas (Pág. 3)</w:t>
       </w:r>
@@ -240,7 +240,7 @@
         <w:rPr>
           <w:rFonts w:ascii="Calibri" w:hAnsi="Calibri"/>
           <w:color w:val="1E293B"/>
-          <w:sz w:val="20"/>
+          <w:sz w:val="19"/>
         </w:rPr>
         <w:t>• 08. Vinculación con los Objetivos de Desarrollo Sostenible (ODS) (Pág. 4)</w:t>
       </w:r>
@@ -253,7 +253,7 @@
         <w:rPr>
           <w:rFonts w:ascii="Calibri" w:hAnsi="Calibri"/>
           <w:color w:val="1E293B"/>
-          <w:sz w:val="20"/>
+          <w:sz w:val="19"/>
         </w:rPr>
         <w:t>• 09. Organización Inicial del Trabajo y Metodología (Pág. 4)</w:t>
       </w:r>
@@ -266,7 +266,7 @@
         <w:rPr>
           <w:rFonts w:ascii="Calibri" w:hAnsi="Calibri"/>
           <w:color w:val="1E293B"/>
-          <w:sz w:val="20"/>
+          <w:sz w:val="19"/>
         </w:rPr>
         <w:t>• 10. Caso de Uso Principal: Prospección, Venta e Implantación del Servicio (Pág. 4)</w:t>
       </w:r>
@@ -279,7 +279,7 @@
         <w:rPr>
           <w:rFonts w:ascii="Calibri" w:hAnsi="Calibri"/>
           <w:color w:val="1E293B"/>
-          <w:sz w:val="20"/>
+          <w:sz w:val="19"/>
         </w:rPr>
         <w:t>• 11. Diagrama de Arquitectura del Sistema (Pág. 5)</w:t>
       </w:r>
@@ -292,7 +292,7 @@
         <w:rPr>
           <w:rFonts w:ascii="Calibri" w:hAnsi="Calibri"/>
           <w:color w:val="1E293B"/>
-          <w:sz w:val="20"/>
+          <w:sz w:val="19"/>
         </w:rPr>
         <w:t>• 12. Mockups de Pantallas Clave de la Aplicación (Pág. 5)</w:t>
       </w:r>
@@ -305,28 +305,28 @@
     <w:p>
       <w:pPr>
         <w:keepNext/>
-        <w:spacing w:before="120" w:after="40"/>
+        <w:spacing w:before="100" w:after="40"/>
       </w:pPr>
       <w:r>
         <w:rPr>
           <w:rFonts w:ascii="Calibri" w:hAnsi="Calibri"/>
           <w:b/>
           <w:color w:val="0A192F"/>
-          <w:sz w:val="26"/>
+          <w:sz w:val="25"/>
         </w:rPr>
         <w:t>01. Título y Descripción del Proyecto: El Servicio LeadCraft AI</w:t>
       </w:r>
     </w:p>
     <w:p>
       <w:pPr>
-        <w:spacing w:line="300" w:lineRule="auto" w:after="60"/>
+        <w:spacing w:line="288" w:lineRule="auto" w:after="50"/>
         <w:jc w:val="both"/>
       </w:pPr>
       <w:r>
         <w:rPr>
           <w:rFonts w:ascii="Calibri" w:hAnsi="Calibri"/>
           <w:color w:val="28323C"/>
-          <w:sz w:val="22"/>
+          <w:sz w:val="21"/>
         </w:rPr>
         <w:t>LeadCraft AI es una solución de software como servicio (SaaS) diseñada para comercializar un servicio integral de digitalización y gestión online para pequeños comercios y profesionales locales (barberías, talleres, clínicas de fisioterapia, restaurantes o tiendas de barrio). El objetivo principal del proyecto no es únicamente crear páginas web estáticas, sino vender un servicio activo que ayuda al comerciante a llevar su negocio en Internet en el día a día: incluye la creación y alojamiento de su página web profesional mediante IA, un sistema integrado para gestionar sus citas y reservas online, catálogo de servicios actualizado, contacto directo por WhatsApp con sus clientes y un panel de control intuitivo desde el móvil o tablet para consultar sus reservas diarias y horarios sin depender de informáticos externos ni costes abusivos.</w:t>
       </w:r>
@@ -334,28 +334,28 @@
     <w:p>
       <w:pPr>
         <w:keepNext/>
-        <w:spacing w:before="120" w:after="40"/>
+        <w:spacing w:before="100" w:after="40"/>
       </w:pPr>
       <w:r>
         <w:rPr>
           <w:rFonts w:ascii="Calibri" w:hAnsi="Calibri"/>
           <w:b/>
           <w:color w:val="0A192F"/>
-          <w:sz w:val="26"/>
+          <w:sz w:val="25"/>
         </w:rPr>
         <w:t>02. Problema o Necesidad: La Dificultad de Llevar un Negocio en Internet</w:t>
       </w:r>
     </w:p>
     <w:p>
       <w:pPr>
-        <w:spacing w:line="300" w:lineRule="auto" w:after="60"/>
+        <w:spacing w:line="288" w:lineRule="auto" w:after="50"/>
         <w:jc w:val="both"/>
       </w:pPr>
       <w:r>
         <w:rPr>
           <w:rFonts w:ascii="Calibri" w:hAnsi="Calibri"/>
           <w:color w:val="28323C"/>
-          <w:sz w:val="22"/>
+          <w:sz w:val="21"/>
         </w:rPr>
         <w:t>Hoy en día, la mayoría de los pequeños comerciantes y autónomos se encuentran desbordados para gestionar su presencia en Internet. Saben que necesitan estar digitalizados, pero no tienen tiempo, conocimientos técnicos ni presupuesto para contratar agencias de marketing o desarrolladores externos (que suelen cobrar entre 800€ y 2.500€ iniciales más cuotas de mantenimiento mensual desproporcionadas). Como consecuencia, muchos negocios solo tienen una ficha básica en Google Maps pero carecen de web propia, no ofrecen citas online y dependen de atender llamadas telefónicas mientras trabajan con un cliente en el local, perdiendo ventas frente a grandes franquicias. LeadCraft AI resuelve esta situación ofreciendo un servicio 'todo en uno' asequible y empaquetado que se encarga de poner en marcha y llevar su tienda o negocio en Internet de forma transparente.</w:t>
       </w:r>
@@ -363,56 +363,56 @@
     <w:p>
       <w:pPr>
         <w:keepNext/>
-        <w:spacing w:before="120" w:after="40"/>
+        <w:spacing w:before="100" w:after="40"/>
       </w:pPr>
       <w:r>
         <w:rPr>
           <w:rFonts w:ascii="Calibri" w:hAnsi="Calibri"/>
           <w:b/>
           <w:color w:val="0A192F"/>
-          <w:sz w:val="26"/>
+          <w:sz w:val="25"/>
         </w:rPr>
         <w:t>03. Usuarios y Público Objetivo</w:t>
       </w:r>
     </w:p>
     <w:p>
       <w:pPr>
-        <w:spacing w:line="300" w:lineRule="auto" w:after="60"/>
+        <w:spacing w:line="288" w:lineRule="auto" w:after="50"/>
         <w:jc w:val="both"/>
       </w:pPr>
       <w:r>
         <w:rPr>
           <w:rFonts w:ascii="Calibri" w:hAnsi="Calibri"/>
           <w:color w:val="28323C"/>
-          <w:sz w:val="22"/>
+          <w:sz w:val="21"/>
         </w:rPr>
         <w:t>• Cliente Principal (El Comerciante / Dueño del Negocio): Propietarios de pymes locales que contratan el servicio de LeadCraft AI para despreocuparse de la complejidad técnica y tener su negocio operativo en Internet (web con citas, carta/catálogo y canal directo de WhatsApp).</w:t>
       </w:r>
     </w:p>
     <w:p>
       <w:pPr>
-        <w:spacing w:line="300" w:lineRule="auto" w:after="60"/>
+        <w:spacing w:line="288" w:lineRule="auto" w:after="50"/>
         <w:jc w:val="both"/>
       </w:pPr>
       <w:r>
         <w:rPr>
           <w:rFonts w:ascii="Calibri" w:hAnsi="Calibri"/>
           <w:color w:val="28323C"/>
-          <w:sz w:val="22"/>
+          <w:sz w:val="21"/>
         </w:rPr>
         <w:t>• Clientes Finales del Negocio: Vecinos y usuarios de la zona que acceden a la web desde su móvil para reservar cita en la peluquería, encargar un pedido o consultar precios a cualquier hora.</w:t>
       </w:r>
     </w:p>
     <w:p>
       <w:pPr>
-        <w:spacing w:line="300" w:lineRule="auto" w:after="60"/>
+        <w:spacing w:line="288" w:lineRule="auto" w:after="50"/>
         <w:jc w:val="both"/>
       </w:pPr>
       <w:r>
         <w:rPr>
           <w:rFonts w:ascii="Calibri" w:hAnsi="Calibri"/>
           <w:color w:val="28323C"/>
-          <w:sz w:val="22"/>
+          <w:sz w:val="21"/>
         </w:rPr>
         <w:t>• Operador Comercial / Gestor de Cuentas: Diseñadores freelance, consultores o alumnos de DAM que utilizan la herramienta sobre Google Maps para identificar comercios con carencias digitales en su zona y ofrecerles el servicio con una demo interactiva ya configurada.</w:t>
       </w:r>
@@ -420,28 +420,28 @@
     <w:p>
       <w:pPr>
         <w:keepNext/>
-        <w:spacing w:before="120" w:after="40"/>
+        <w:spacing w:before="100" w:after="40"/>
       </w:pPr>
       <w:r>
         <w:rPr>
           <w:rFonts w:ascii="Calibri" w:hAnsi="Calibri"/>
           <w:b/>
           <w:color w:val="0A192F"/>
-          <w:sz w:val="26"/>
+          <w:sz w:val="25"/>
         </w:rPr>
         <w:t>04. Benchmarking Competitivo y Soluciones Similares</w:t>
       </w:r>
     </w:p>
     <w:p>
       <w:pPr>
-        <w:spacing w:line="300" w:lineRule="auto" w:after="60"/>
+        <w:spacing w:line="288" w:lineRule="auto" w:after="50"/>
         <w:jc w:val="both"/>
       </w:pPr>
       <w:r>
         <w:rPr>
           <w:rFonts w:ascii="Calibri" w:hAnsi="Calibri"/>
           <w:color w:val="28323C"/>
-          <w:sz w:val="22"/>
+          <w:sz w:val="21"/>
         </w:rPr>
         <w:t>Se han analizado tres alternativas actuales en el mercado para comparar cómo abordan la digitalización de pymes:</w:t>
       </w:r>
@@ -452,12 +452,20 @@
         <w:jc w:val="center"/>
         <w:tblLayout w:type="fixed"/>
         <w:tblLook w:firstColumn="1" w:firstRow="1" w:lastColumn="0" w:lastRow="0" w:noHBand="0" w:noVBand="1" w:val="04A0"/>
+        <w:tblBorders>
+          <w:top w:val="single" w:sz="4" w:space="0" w:color="CBD5E1"/>
+          <w:bottom w:val="single" w:sz="6" w:space="0" w:color="0A192F"/>
+          <w:insideH w:val="single" w:sz="4" w:space="0" w:color="E2E8F0"/>
+          <w:insideV w:val="none"/>
+          <w:left w:val="none"/>
+          <w:right w:val="none"/>
+        </w:tblBorders>
       </w:tblPr>
       <w:tblGrid>
-        <w:gridCol w:w="2401"/>
-        <w:gridCol w:w="2401"/>
-        <w:gridCol w:w="2401"/>
-        <w:gridCol w:w="2401"/>
+        <w:gridCol w:w="2437"/>
+        <w:gridCol w:w="2437"/>
+        <w:gridCol w:w="2437"/>
+        <w:gridCol w:w="2437"/>
       </w:tblGrid>
       <w:tr>
         <w:tc>
@@ -471,7 +479,7 @@
                 <w:rFonts w:ascii="Calibri" w:hAnsi="Calibri"/>
                 <w:b/>
                 <w:color w:val="FFFFFF"/>
-                <w:sz w:val="19"/>
+                <w:sz w:val="18"/>
               </w:rPr>
               <w:t>Plataforma</w:t>
             </w:r>
@@ -488,7 +496,7 @@
                 <w:rFonts w:ascii="Calibri" w:hAnsi="Calibri"/>
                 <w:b/>
                 <w:color w:val="FFFFFF"/>
-                <w:sz w:val="19"/>
+                <w:sz w:val="18"/>
               </w:rPr>
               <w:t>Modelo / Enfoque</w:t>
             </w:r>
@@ -505,7 +513,7 @@
                 <w:rFonts w:ascii="Calibri" w:hAnsi="Calibri"/>
                 <w:b/>
                 <w:color w:val="FFFFFF"/>
-                <w:sz w:val="19"/>
+                <w:sz w:val="18"/>
               </w:rPr>
               <w:t>Puntos Fuertes</w:t>
             </w:r>
@@ -522,7 +530,7 @@
                 <w:rFonts w:ascii="Calibri" w:hAnsi="Calibri"/>
                 <w:b/>
                 <w:color w:val="FFFFFF"/>
-                <w:sz w:val="19"/>
+                <w:sz w:val="18"/>
               </w:rPr>
               <w:t>Carencias frente al Servicio LeadCraft</w:t>
             </w:r>
@@ -537,16 +545,16 @@
           </w:tcPr>
           <w:p>
             <w:pPr>
-              <w:spacing w:line="276" w:lineRule="auto" w:before="30" w:after="30"/>
+              <w:spacing w:line="276" w:lineRule="auto" w:before="40" w:after="40"/>
             </w:pPr>
             <w:r>
               <w:rPr>
                 <w:rFonts w:ascii="Calibri" w:hAnsi="Calibri"/>
                 <w:b/>
-                <w:color w:val="232F3E"/>
+                <w:color w:val="1E293B"/>
                 <w:sz w:val="17"/>
               </w:rPr>
-              <w:t>Wix / Squarespace (con IA)</w:t>
+              <w:t>Wix Studio / Duda</w:t>
             </w:r>
           </w:p>
         </w:tc>
@@ -557,15 +565,15 @@
           </w:tcPr>
           <w:p>
             <w:pPr>
-              <w:spacing w:line="276" w:lineRule="auto" w:before="30" w:after="30"/>
+              <w:spacing w:line="276" w:lineRule="auto" w:before="40" w:after="40"/>
             </w:pPr>
             <w:r>
               <w:rPr>
                 <w:rFonts w:ascii="Calibri" w:hAnsi="Calibri"/>
-                <w:color w:val="232F3E"/>
+                <w:color w:val="1E293B"/>
                 <w:sz w:val="17"/>
               </w:rPr>
-              <w:t>Plataformas de autoservicio para construir páginas web.</w:t>
+              <w:t>Generadores web SaaS con IA para crear sitios web corporativos.</w:t>
             </w:r>
           </w:p>
         </w:tc>
@@ -576,15 +584,15 @@
           </w:tcPr>
           <w:p>
             <w:pPr>
-              <w:spacing w:line="276" w:lineRule="auto" w:before="30" w:after="30"/>
+              <w:spacing w:line="276" w:lineRule="auto" w:before="40" w:after="40"/>
             </w:pPr>
             <w:r>
               <w:rPr>
                 <w:rFonts w:ascii="Calibri" w:hAnsi="Calibri"/>
-                <w:color w:val="232F3E"/>
+                <w:color w:val="1E293B"/>
                 <w:sz w:val="17"/>
               </w:rPr>
-              <w:t>Diseño visual atractivo y herramientas avanzadas de personalización.</w:t>
+              <w:t>Diseños modernos y plantillas responsive bien estructuradas.</w:t>
             </w:r>
           </w:p>
         </w:tc>
@@ -595,15 +603,15 @@
           </w:tcPr>
           <w:p>
             <w:pPr>
-              <w:spacing w:line="276" w:lineRule="auto" w:before="30" w:after="30"/>
+              <w:spacing w:line="276" w:lineRule="auto" w:before="40" w:after="40"/>
             </w:pPr>
             <w:r>
               <w:rPr>
                 <w:rFonts w:ascii="Calibri" w:hAnsi="Calibri"/>
-                <w:color w:val="232F3E"/>
+                <w:color w:val="1E293B"/>
                 <w:sz w:val="17"/>
               </w:rPr>
-              <w:t>Exigen que el propio comerciante dedique horas a configurarlo todo; no incluyen prospección sobre mapa ni resuelven la gestión diaria de pymes sin tiempo.</w:t>
+              <w:t>No incluye prospección en Maps ni detecta carencias; requiere que el comerciante dedique tiempo a construir y maquetar la web por su cuenta.</w:t>
             </w:r>
           </w:p>
         </w:tc>
@@ -616,16 +624,16 @@
           </w:tcPr>
           <w:p>
             <w:pPr>
-              <w:spacing w:line="276" w:lineRule="auto" w:before="30" w:after="30"/>
+              <w:spacing w:line="276" w:lineRule="auto" w:before="40" w:after="40"/>
             </w:pPr>
             <w:r>
               <w:rPr>
                 <w:rFonts w:ascii="Calibri" w:hAnsi="Calibri"/>
                 <w:b/>
-                <w:color w:val="232F3E"/>
+                <w:color w:val="1E293B"/>
                 <w:sz w:val="17"/>
               </w:rPr>
-              <w:t>D7 Lead Finder / Scrapers</w:t>
+              <w:t>D7 Lead Finder</w:t>
             </w:r>
           </w:p>
         </w:tc>
@@ -636,15 +644,15 @@
           </w:tcPr>
           <w:p>
             <w:pPr>
-              <w:spacing w:line="276" w:lineRule="auto" w:before="30" w:after="30"/>
+              <w:spacing w:line="276" w:lineRule="auto" w:before="40" w:after="40"/>
             </w:pPr>
             <w:r>
               <w:rPr>
                 <w:rFonts w:ascii="Calibri" w:hAnsi="Calibri"/>
-                <w:color w:val="232F3E"/>
+                <w:color w:val="1E293B"/>
                 <w:sz w:val="17"/>
               </w:rPr>
-              <w:t>Herramientas de extracción masiva de datos en Google Maps.</w:t>
+              <w:t>Buscadores de leads que extraen datos de contacto desde Google Maps.</w:t>
             </w:r>
           </w:p>
         </w:tc>
@@ -655,15 +663,15 @@
           </w:tcPr>
           <w:p>
             <w:pPr>
-              <w:spacing w:line="276" w:lineRule="auto" w:before="30" w:after="30"/>
+              <w:spacing w:line="276" w:lineRule="auto" w:before="40" w:after="40"/>
             </w:pPr>
             <w:r>
               <w:rPr>
                 <w:rFonts w:ascii="Calibri" w:hAnsi="Calibri"/>
-                <w:color w:val="232F3E"/>
+                <w:color w:val="1E293B"/>
                 <w:sz w:val="17"/>
               </w:rPr>
-              <w:t>Rapidez para extraer listas de teléfonos y correos en archivos CSV.</w:t>
+              <w:t>Rápida extracción masiva de correos y teléfonos de negocios.</w:t>
             </w:r>
           </w:p>
         </w:tc>
@@ -674,15 +682,15 @@
           </w:tcPr>
           <w:p>
             <w:pPr>
-              <w:spacing w:line="276" w:lineRule="auto" w:before="30" w:after="30"/>
+              <w:spacing w:line="276" w:lineRule="auto" w:before="40" w:after="40"/>
             </w:pPr>
             <w:r>
               <w:rPr>
                 <w:rFonts w:ascii="Calibri" w:hAnsi="Calibri"/>
-                <w:color w:val="232F3E"/>
+                <w:color w:val="1E293B"/>
                 <w:sz w:val="17"/>
               </w:rPr>
-              <w:t>Son simples listados en frío; no ofrecen ningún servicio de gestión para el negocio ni generan ninguna web ni sistema de citas que el cliente pueda ver.</w:t>
+              <w:t>Se limita a generar listados de texto en Excel; no audita carencias reales, no genera la solución web ni integra reservas.</w:t>
             </w:r>
           </w:p>
         </w:tc>
@@ -695,16 +703,16 @@
           </w:tcPr>
           <w:p>
             <w:pPr>
-              <w:spacing w:line="276" w:lineRule="auto" w:before="30" w:after="30"/>
+              <w:spacing w:line="276" w:lineRule="auto" w:before="40" w:after="40"/>
             </w:pPr>
             <w:r>
               <w:rPr>
                 <w:rFonts w:ascii="Calibri" w:hAnsi="Calibri"/>
                 <w:b/>
-                <w:color w:val="232F3E"/>
+                <w:color w:val="1E293B"/>
                 <w:sz w:val="17"/>
               </w:rPr>
-              <w:t>Treatwell / Calendly</w:t>
+              <w:t>Calendly / Treatwell</w:t>
             </w:r>
           </w:p>
         </w:tc>
@@ -715,15 +723,15 @@
           </w:tcPr>
           <w:p>
             <w:pPr>
-              <w:spacing w:line="276" w:lineRule="auto" w:before="30" w:after="30"/>
+              <w:spacing w:line="276" w:lineRule="auto" w:before="40" w:after="40"/>
             </w:pPr>
             <w:r>
               <w:rPr>
                 <w:rFonts w:ascii="Calibri" w:hAnsi="Calibri"/>
-                <w:color w:val="232F3E"/>
+                <w:color w:val="1E293B"/>
                 <w:sz w:val="17"/>
               </w:rPr>
-              <w:t>Portales verticales de reserva de citas y agendas online.</w:t>
+              <w:t>Software especializado en reservas y gestión de citas online.</w:t>
             </w:r>
           </w:p>
         </w:tc>
@@ -734,15 +742,15 @@
           </w:tcPr>
           <w:p>
             <w:pPr>
-              <w:spacing w:line="276" w:lineRule="auto" w:before="30" w:after="30"/>
+              <w:spacing w:line="276" w:lineRule="auto" w:before="40" w:after="40"/>
             </w:pPr>
             <w:r>
               <w:rPr>
                 <w:rFonts w:ascii="Calibri" w:hAnsi="Calibri"/>
-                <w:color w:val="232F3E"/>
+                <w:color w:val="1E293B"/>
                 <w:sz w:val="17"/>
               </w:rPr>
-              <w:t>Sistemas de reserva consolidados con recordatorios por correo.</w:t>
+              <w:t>Calendarios eficaces con recordatorios automáticos por SMS/correo.</w:t>
             </w:r>
           </w:p>
         </w:tc>
@@ -753,15 +761,15 @@
           </w:tcPr>
           <w:p>
             <w:pPr>
-              <w:spacing w:line="276" w:lineRule="auto" w:before="30" w:after="30"/>
+              <w:spacing w:line="276" w:lineRule="auto" w:before="40" w:after="40"/>
             </w:pPr>
             <w:r>
               <w:rPr>
                 <w:rFonts w:ascii="Calibri" w:hAnsi="Calibri"/>
-                <w:color w:val="232F3E"/>
+                <w:color w:val="1E293B"/>
                 <w:sz w:val="17"/>
               </w:rPr>
-              <w:t>Son herramientas aisladas que no proporcionan la web del negocio, cobran comisiones elevadas por cada reserva y no ofrecen un servicio integral de marca.</w:t>
+              <w:t>Son herramientas aisladas que no proporcionan la web del negocio ni canal directo por WhatsApp; comisiones por reserva abusivas en el caso de Treatwell.</w:t>
             </w:r>
           </w:p>
         </w:tc>
@@ -775,84 +783,84 @@
     <w:p>
       <w:pPr>
         <w:keepNext/>
-        <w:spacing w:before="120" w:after="40"/>
+        <w:spacing w:before="100" w:after="40"/>
       </w:pPr>
       <w:r>
         <w:rPr>
           <w:rFonts w:ascii="Calibri" w:hAnsi="Calibri"/>
           <w:b/>
           <w:color w:val="0A192F"/>
-          <w:sz w:val="26"/>
+          <w:sz w:val="25"/>
         </w:rPr>
         <w:t>05. Objetivos Iniciales del Proyecto (Modelo SMART)</w:t>
       </w:r>
     </w:p>
     <w:p>
       <w:pPr>
-        <w:spacing w:line="300" w:lineRule="auto" w:after="60"/>
+        <w:spacing w:line="288" w:lineRule="auto" w:after="50"/>
         <w:jc w:val="both"/>
       </w:pPr>
       <w:r>
         <w:rPr>
           <w:rFonts w:ascii="Calibri" w:hAnsi="Calibri"/>
           <w:color w:val="28323C"/>
-          <w:sz w:val="22"/>
+          <w:sz w:val="21"/>
         </w:rPr>
         <w:t>• Específico (S): Desarrollar una solución integral que permita activar un servicio digital completo para pequeños negocios locales (web profesional generada con IA mediante Google Gemini + widget de reservas online + panel de control simplificado para el comerciante).</w:t>
       </w:r>
     </w:p>
     <w:p>
       <w:pPr>
-        <w:spacing w:line="300" w:lineRule="auto" w:after="60"/>
+        <w:spacing w:line="288" w:lineRule="auto" w:after="50"/>
         <w:jc w:val="both"/>
       </w:pPr>
       <w:r>
         <w:rPr>
           <w:rFonts w:ascii="Calibri" w:hAnsi="Calibri"/>
           <w:color w:val="28323C"/>
-          <w:sz w:val="22"/>
+          <w:sz w:val="21"/>
         </w:rPr>
         <w:t>• Medible (M): Conseguir que el tiempo de configuración y despliegue del servicio sea inferior a 60 segundos por comercio, y estructurar una oferta de servicio asequible para pymes con un coste inferior a 25€/mes frente a los costes tradicionales de agencia.</w:t>
       </w:r>
     </w:p>
     <w:p>
       <w:pPr>
-        <w:spacing w:line="300" w:lineRule="auto" w:after="60"/>
+        <w:spacing w:line="288" w:lineRule="auto" w:after="50"/>
         <w:jc w:val="both"/>
       </w:pPr>
       <w:r>
         <w:rPr>
           <w:rFonts w:ascii="Calibri" w:hAnsi="Calibri"/>
           <w:color w:val="28323C"/>
-          <w:sz w:val="22"/>
+          <w:sz w:val="21"/>
         </w:rPr>
         <w:t>• Alcanzable (A): Desarrollar el sistema utilizando tecnologías multiplataforma dominadas en el ciclo (FastAPI en backend, Flutter/Web en frontend y bases de datos relacionales SQLite/PostgreSQL) con plantillas modulares prediseñadas por sector.</w:t>
       </w:r>
     </w:p>
     <w:p>
       <w:pPr>
-        <w:spacing w:line="300" w:lineRule="auto" w:after="60"/>
+        <w:spacing w:line="288" w:lineRule="auto" w:after="50"/>
         <w:jc w:val="both"/>
       </w:pPr>
       <w:r>
         <w:rPr>
           <w:rFonts w:ascii="Calibri" w:hAnsi="Calibri"/>
           <w:color w:val="28323C"/>
-          <w:sz w:val="22"/>
+          <w:sz w:val="21"/>
         </w:rPr>
         <w:t>• Relevante (R): Cubre una necesidad real del mercado: transformar el tejido comercial de barrio dotándolo de autonomía digital y creando una oportunidad de autoempleo para titulados de DAM.</w:t>
       </w:r>
     </w:p>
     <w:p>
       <w:pPr>
-        <w:spacing w:line="300" w:lineRule="auto" w:after="60"/>
+        <w:spacing w:line="288" w:lineRule="auto" w:after="50"/>
         <w:jc w:val="both"/>
       </w:pPr>
       <w:r>
         <w:rPr>
           <w:rFonts w:ascii="Calibri" w:hAnsi="Calibri"/>
           <w:color w:val="28323C"/>
-          <w:sz w:val="22"/>
+          <w:sz w:val="21"/>
         </w:rPr>
         <w:t>• Temporal (T): Cumplir la planificación académica en tres entregas: Hito 1 en octubre, Hito 2 (MVP funcional) en enero y Hito 3 (plataforma completa con panel de comerciante) en marzo/abril de 2027.</w:t>
       </w:r>
@@ -860,127 +868,225 @@
     <w:p>
       <w:pPr>
         <w:keepNext/>
-        <w:spacing w:before="120" w:after="40"/>
+        <w:spacing w:before="100" w:after="40"/>
       </w:pPr>
       <w:r>
         <w:rPr>
           <w:rFonts w:ascii="Calibri" w:hAnsi="Calibri"/>
           <w:b/>
           <w:color w:val="0A192F"/>
-          <w:sz w:val="26"/>
+          <w:sz w:val="25"/>
         </w:rPr>
         <w:t>06. Alcance Mínimo Viable (MVP) y Ampliaciones Futuras</w:t>
       </w:r>
     </w:p>
     <w:p>
       <w:pPr>
-        <w:spacing w:line="300" w:lineRule="auto" w:after="60"/>
+        <w:spacing w:line="288" w:lineRule="auto" w:after="50"/>
         <w:jc w:val="both"/>
       </w:pPr>
       <w:r>
         <w:rPr>
           <w:rFonts w:ascii="Calibri" w:hAnsi="Calibri"/>
           <w:color w:val="28323C"/>
-          <w:sz w:val="22"/>
+          <w:sz w:val="21"/>
         </w:rPr>
         <w:t>• Funcionalidades del MVP (Versión 1.0 del Servicio):</w:t>
       </w:r>
     </w:p>
     <w:p>
       <w:pPr>
-        <w:spacing w:line="300" w:lineRule="auto" w:after="60"/>
+        <w:spacing w:line="276" w:lineRule="auto" w:after="30"/>
+        <w:ind w:left="288"/>
+      </w:pPr>
+      <w:r>
+        <w:rPr>
+          <w:rFonts w:ascii="Calibri" w:hAnsi="Calibri"/>
+          <w:color w:val="28323C"/>
+          <w:sz w:val="19"/>
+        </w:rPr>
+        <w:t>1) Módulo de localización y auditoría express de comercios sobre Google Maps (detección de carencias web y reservas).</w:t>
+      </w:r>
+    </w:p>
+    <w:p>
+      <w:pPr>
+        <w:spacing w:line="276" w:lineRule="auto" w:after="30"/>
+        <w:ind w:left="288"/>
+      </w:pPr>
+      <w:r>
+        <w:rPr>
+          <w:rFonts w:ascii="Calibri" w:hAnsi="Calibri"/>
+          <w:color w:val="28323C"/>
+          <w:sz w:val="19"/>
+        </w:rPr>
+        <w:t>2) Motor de generación con IA de la web del negocio (redacción comercial de servicios, horarios y fotos de Maps).</w:t>
+      </w:r>
+    </w:p>
+    <w:p>
+      <w:pPr>
+        <w:spacing w:line="276" w:lineRule="auto" w:after="30"/>
+        <w:ind w:left="288"/>
+      </w:pPr>
+      <w:r>
+        <w:rPr>
+          <w:rFonts w:ascii="Calibri" w:hAnsi="Calibri"/>
+          <w:color w:val="28323C"/>
+          <w:sz w:val="19"/>
+        </w:rPr>
+        <w:t>3) Widget interactivo de citas y reservas online incrustado en la web con selección de franjas horarias.</w:t>
+      </w:r>
+    </w:p>
+    <w:p>
+      <w:pPr>
+        <w:spacing w:line="276" w:lineRule="auto" w:after="30"/>
+        <w:ind w:left="288"/>
+      </w:pPr>
+      <w:r>
+        <w:rPr>
+          <w:rFonts w:ascii="Calibri" w:hAnsi="Calibri"/>
+          <w:color w:val="28323C"/>
+          <w:sz w:val="19"/>
+        </w:rPr>
+        <w:t>4) Panel de gestión básico para el comerciante donde puede consultar las citas recibidas y cambiar horarios desde su móvil.</w:t>
+      </w:r>
+    </w:p>
+    <w:p>
+      <w:pPr>
+        <w:spacing w:line="276" w:lineRule="auto" w:after="30"/>
+        <w:ind w:left="288"/>
+      </w:pPr>
+      <w:r>
+        <w:rPr>
+          <w:rFonts w:ascii="Calibri" w:hAnsi="Calibri"/>
+          <w:color w:val="28323C"/>
+          <w:sz w:val="19"/>
+        </w:rPr>
+        <w:t>5) Integración de botón de contacto directo por WhatsApp Business.</w:t>
+      </w:r>
+    </w:p>
+    <w:p>
+      <w:pPr>
+        <w:spacing w:line="276" w:lineRule="auto" w:after="30"/>
+        <w:ind w:left="288"/>
+      </w:pPr>
+      <w:r>
+        <w:rPr>
+          <w:rFonts w:ascii="Calibri" w:hAnsi="Calibri"/>
+          <w:color w:val="28323C"/>
+          <w:sz w:val="19"/>
+        </w:rPr>
+        <w:t>6) Exportación de la web en paquete HTML5/Tailwind y generación de informe comercial de auditoría en PDF.</w:t>
+      </w:r>
+    </w:p>
+    <w:p>
+      <w:pPr>
+        <w:spacing w:line="288" w:lineRule="auto" w:after="50"/>
         <w:jc w:val="both"/>
       </w:pPr>
       <w:r>
         <w:rPr>
           <w:rFonts w:ascii="Calibri" w:hAnsi="Calibri"/>
           <w:color w:val="28323C"/>
-          <w:sz w:val="22"/>
+          <w:sz w:val="21"/>
         </w:rPr>
-        <w:t xml:space="preserve">  1) Módulo de localización y auditoría express de comercios sobre Google Maps (detección de carencias web y reservas).&lt;br/&gt;  2) Motor de generación con IA de la web del negocio (redacción comercial de servicios, horarios y fotos de Maps).&lt;br/&gt;  3) Widget interactivo de citas y reservas online incrustado en la web con selección de franjas horarias.&lt;br/&gt;  4) Panel de gestión básico para el comerciante donde puede consultar las citas recibidas y cambiar horarios desde su móvil.&lt;br/&gt;  5) Integración de botón de contacto directo por WhatsApp Business.&lt;br/&gt;  6) Exportación de la web en paquete HTML5/Tailwind y generación de informe comercial de auditoría en PDF.</w:t>
+        <w:t>• Ampliaciones Futuras (Versión 2.0):</w:t>
       </w:r>
     </w:p>
     <w:p>
       <w:pPr>
-        <w:spacing w:line="300" w:lineRule="auto" w:after="60"/>
+        <w:spacing w:line="276" w:lineRule="auto" w:after="30"/>
+        <w:ind w:left="288"/>
+      </w:pPr>
+      <w:r>
+        <w:rPr>
+          <w:rFonts w:ascii="Calibri" w:hAnsi="Calibri"/>
+          <w:color w:val="28323C"/>
+          <w:sz w:val="19"/>
+        </w:rPr>
+        <w:t>1) Bot inteligente de WhatsApp con IA que responde preguntas de los clientes y agenda citas de forma automática 24/7.</w:t>
+      </w:r>
+    </w:p>
+    <w:p>
+      <w:pPr>
+        <w:spacing w:line="276" w:lineRule="auto" w:after="30"/>
+        <w:ind w:left="288"/>
+      </w:pPr>
+      <w:r>
+        <w:rPr>
+          <w:rFonts w:ascii="Calibri" w:hAnsi="Calibri"/>
+          <w:color w:val="28323C"/>
+          <w:sz w:val="19"/>
+        </w:rPr>
+        <w:t>2) Pasarela de cobro integrada con Stripe para permitir a los clientes pagar señales o productos online.</w:t>
+      </w:r>
+    </w:p>
+    <w:p>
+      <w:pPr>
+        <w:spacing w:line="276" w:lineRule="auto" w:after="30"/>
+        <w:ind w:left="288"/>
+      </w:pPr>
+      <w:r>
+        <w:rPr>
+          <w:rFonts w:ascii="Calibri" w:hAnsi="Calibri"/>
+          <w:color w:val="28323C"/>
+          <w:sz w:val="19"/>
+        </w:rPr>
+        <w:t>3) Alojamiento cloud automatizado en Vercel/Netlify con asignación de dominios propios (.es / .com) con 1 clic.</w:t>
+      </w:r>
+    </w:p>
+    <w:p>
+      <w:pPr>
+        <w:keepNext/>
+        <w:spacing w:before="100" w:after="40"/>
+      </w:pPr>
+      <w:r>
+        <w:rPr>
+          <w:rFonts w:ascii="Calibri" w:hAnsi="Calibri"/>
+          <w:b/>
+          <w:color w:val="0A192F"/>
+          <w:sz w:val="25"/>
+        </w:rPr>
+        <w:t>07. Riesgos Iniciales y Medidas Preventivas</w:t>
+      </w:r>
+    </w:p>
+    <w:p>
+      <w:pPr>
+        <w:spacing w:line="288" w:lineRule="auto" w:after="50"/>
         <w:jc w:val="both"/>
       </w:pPr>
       <w:r>
         <w:rPr>
           <w:rFonts w:ascii="Calibri" w:hAnsi="Calibri"/>
           <w:color w:val="28323C"/>
-          <w:sz w:val="22"/>
+          <w:sz w:val="21"/>
         </w:rPr>
-        <w:t>• Ampliaciones Futuras (Versión 2.0):</w:t>
+        <w:t>• Riesgo 1: Coste de las llamadas a Google Places API y modelos de IA. Medida: Implementar almacenamiento en caché local (base de datos) para no repetir consultas sobre el mismo comercio y comprimir los prompts enviados a Gemini.</w:t>
       </w:r>
     </w:p>
     <w:p>
       <w:pPr>
-        <w:spacing w:line="300" w:lineRule="auto" w:after="60"/>
+        <w:spacing w:line="288" w:lineRule="auto" w:after="50"/>
         <w:jc w:val="both"/>
       </w:pPr>
       <w:r>
         <w:rPr>
           <w:rFonts w:ascii="Calibri" w:hAnsi="Calibri"/>
           <w:color w:val="28323C"/>
-          <w:sz w:val="22"/>
+          <w:sz w:val="21"/>
         </w:rPr>
-        <w:t xml:space="preserve">  1) Bot inteligente de WhatsApp con IA que responde preguntas de los clientes y agenda citas de forma automática 24/7.&lt;br/&gt;  2) Pasarela de cobro integrada con Stripe para permitir a los clientes pagar señales o productos online.&lt;br/&gt;  3) Alojamiento cloud automatizado en Vercel/Netlify con asignación de dominios propios (.es / .com) con 1 clic.</w:t>
+        <w:t>• Riesgo 2: Reticencia del comerciante a la tecnología o falta de uso. Medida: Diseñar el panel de gestión con una interfaz ultrasimplificada tipo 'Modo Fácil', similar a WhatsApp, sin menús complicados ni términos técnicos.</w:t>
       </w:r>
     </w:p>
     <w:p>
       <w:pPr>
-        <w:keepNext/>
-        <w:spacing w:before="120" w:after="40"/>
-      </w:pPr>
-      <w:r>
-        <w:rPr>
-          <w:rFonts w:ascii="Calibri" w:hAnsi="Calibri"/>
-          <w:b/>
-          <w:color w:val="0A192F"/>
-          <w:sz w:val="26"/>
-        </w:rPr>
-        <w:t>07. Riesgos Iniciales y Medidas Preventivas</w:t>
-      </w:r>
-    </w:p>
-    <w:p>
-      <w:pPr>
-        <w:spacing w:line="300" w:lineRule="auto" w:after="60"/>
+        <w:spacing w:line="288" w:lineRule="auto" w:after="50"/>
         <w:jc w:val="both"/>
       </w:pPr>
       <w:r>
         <w:rPr>
           <w:rFonts w:ascii="Calibri" w:hAnsi="Calibri"/>
           <w:color w:val="28323C"/>
-          <w:sz w:val="22"/>
-        </w:rPr>
-        <w:t>• Riesgo 1: Coste de las llamadas a Google Places API y modelos de IA. Medida: Implementar almacenamiento en caché local (base de datos) para no repetir consultas sobre el mismo comercio y comprimir los prompts enviados a Gemini.</w:t>
-      </w:r>
-    </w:p>
-    <w:p>
-      <w:pPr>
-        <w:spacing w:line="300" w:lineRule="auto" w:after="60"/>
-        <w:jc w:val="both"/>
-      </w:pPr>
-      <w:r>
-        <w:rPr>
-          <w:rFonts w:ascii="Calibri" w:hAnsi="Calibri"/>
-          <w:color w:val="28323C"/>
-          <w:sz w:val="22"/>
-        </w:rPr>
-        <w:t>• Riesgo 2: Reticencia del comerciante a la tecnología o falta de uso. Medida: Diseñar el panel de gestión con una interfaz ultrasimplificada tipo 'Modo Fácil', similar a WhatsApp, sin menús complicados ni términos técnicos.</w:t>
-      </w:r>
-    </w:p>
-    <w:p>
-      <w:pPr>
-        <w:spacing w:line="300" w:lineRule="auto" w:after="60"/>
-        <w:jc w:val="both"/>
-      </w:pPr>
-      <w:r>
-        <w:rPr>
-          <w:rFonts w:ascii="Calibri" w:hAnsi="Calibri"/>
-          <w:color w:val="28323C"/>
-          <w:sz w:val="22"/>
+          <w:sz w:val="21"/>
         </w:rPr>
         <w:t>• Riesgo 3: Gestión del tiempo durante el curso escolar. Medida: Priorización estricta de tareas según el método MoSCoW, asegurando que el flujo de venta y el panel de citas funcionen antes de añadir florituras estéticas.</w:t>
       </w:r>
@@ -993,56 +1099,56 @@
     <w:p>
       <w:pPr>
         <w:keepNext/>
-        <w:spacing w:before="120" w:after="40"/>
+        <w:spacing w:before="100" w:after="40"/>
       </w:pPr>
       <w:r>
         <w:rPr>
           <w:rFonts w:ascii="Calibri" w:hAnsi="Calibri"/>
           <w:b/>
           <w:color w:val="0A192F"/>
-          <w:sz w:val="26"/>
+          <w:sz w:val="25"/>
         </w:rPr>
         <w:t>08. Vinculación con los Objetivos de Desarrollo Sostenible (ODS)</w:t>
       </w:r>
     </w:p>
     <w:p>
       <w:pPr>
-        <w:spacing w:line="300" w:lineRule="auto" w:after="60"/>
+        <w:spacing w:line="288" w:lineRule="auto" w:after="50"/>
         <w:jc w:val="both"/>
       </w:pPr>
       <w:r>
         <w:rPr>
           <w:rFonts w:ascii="Calibri" w:hAnsi="Calibri"/>
           <w:color w:val="28323C"/>
-          <w:sz w:val="22"/>
+          <w:sz w:val="21"/>
         </w:rPr>
         <w:t>• ODS 8: Trabajo Decente y Crecimiento Económico (Meta 8.3): LeadCraft AI impulsa la competitividad y modernización de las microempresas y trabajadores autónomos de barrio, dándoles herramientas para incrementar sus ventas y competir con grandes cadenas multinacionales.</w:t>
       </w:r>
     </w:p>
     <w:p>
       <w:pPr>
-        <w:spacing w:line="300" w:lineRule="auto" w:after="60"/>
+        <w:spacing w:line="288" w:lineRule="auto" w:after="50"/>
         <w:jc w:val="both"/>
       </w:pPr>
       <w:r>
         <w:rPr>
           <w:rFonts w:ascii="Calibri" w:hAnsi="Calibri"/>
           <w:color w:val="28323C"/>
-          <w:sz w:val="22"/>
+          <w:sz w:val="21"/>
         </w:rPr>
         <w:t>• ODS 9: Industria, Innovación e Infraestructura (Meta 9.3): Democratiza el acceso a la inteligencia artificial generativa y a infraestructuras web avanzadas para comercios tradicionales con presupuestos modestos.</w:t>
       </w:r>
     </w:p>
     <w:p>
       <w:pPr>
-        <w:spacing w:line="300" w:lineRule="auto" w:after="60"/>
+        <w:spacing w:line="288" w:lineRule="auto" w:after="50"/>
         <w:jc w:val="both"/>
       </w:pPr>
       <w:r>
         <w:rPr>
           <w:rFonts w:ascii="Calibri" w:hAnsi="Calibri"/>
           <w:color w:val="28323C"/>
-          <w:sz w:val="22"/>
+          <w:sz w:val="21"/>
         </w:rPr>
         <w:t>• ODS 11: Ciudades y Comunidades Sostenibles (Meta 11.a): Fortalece el comercio de proximidad, garantizando que los servicios esenciales y tiendas de barrio sigan vivos y conectados con los vecinos en la era digital.</w:t>
       </w:r>
@@ -1050,28 +1156,28 @@
     <w:p>
       <w:pPr>
         <w:keepNext/>
-        <w:spacing w:before="120" w:after="40"/>
+        <w:spacing w:before="100" w:after="40"/>
       </w:pPr>
       <w:r>
         <w:rPr>
           <w:rFonts w:ascii="Calibri" w:hAnsi="Calibri"/>
           <w:b/>
           <w:color w:val="0A192F"/>
-          <w:sz w:val="26"/>
+          <w:sz w:val="25"/>
         </w:rPr>
         <w:t>09. Organización Inicial del Trabajo y Metodología</w:t>
       </w:r>
     </w:p>
     <w:p>
       <w:pPr>
-        <w:spacing w:line="300" w:lineRule="auto" w:after="60"/>
+        <w:spacing w:line="288" w:lineRule="auto" w:after="50"/>
         <w:jc w:val="both"/>
       </w:pPr>
       <w:r>
         <w:rPr>
           <w:rFonts w:ascii="Calibri" w:hAnsi="Calibri"/>
           <w:color w:val="28323C"/>
-          <w:sz w:val="22"/>
+          <w:sz w:val="21"/>
         </w:rPr>
         <w:t>El proyecto se desarrollará siguiendo el marco ágil Scrum apoyado en un tablero Kanban de Trello para la gestión del Product Backlog. El desarrollo se organiza en tres Sprints principales: Sprint 1 (Explorador sobre Maps, API de Places y motor de auditoría); Sprint 2 (Generador web con IA de Gemini, catálogo de plantillas por sector y widget de citas online); Sprint 3 (Panel de control del comerciante, exportación cloud/PDF, integración de WhatsApp y pruebas de usuario).</w:t>
       </w:r>
@@ -1079,98 +1185,98 @@
     <w:p>
       <w:pPr>
         <w:keepNext/>
-        <w:spacing w:before="120" w:after="40"/>
+        <w:spacing w:before="100" w:after="40"/>
       </w:pPr>
       <w:r>
         <w:rPr>
           <w:rFonts w:ascii="Calibri" w:hAnsi="Calibri"/>
           <w:b/>
           <w:color w:val="0A192F"/>
-          <w:sz w:val="26"/>
+          <w:sz w:val="25"/>
         </w:rPr>
         <w:t>10. Caso de Uso Principal: Prospección, Venta e Implantación del Servicio</w:t>
       </w:r>
     </w:p>
     <w:p>
       <w:pPr>
-        <w:spacing w:line="300" w:lineRule="auto" w:after="60"/>
+        <w:spacing w:line="288" w:lineRule="auto" w:after="50"/>
         <w:jc w:val="both"/>
       </w:pPr>
       <w:r>
         <w:rPr>
           <w:rFonts w:ascii="Calibri" w:hAnsi="Calibri"/>
           <w:color w:val="28323C"/>
-          <w:sz w:val="22"/>
+          <w:sz w:val="21"/>
         </w:rPr>
         <w:t>A continuación se detalla el flujo de funcionamiento y comercialización del servicio:</w:t>
       </w:r>
     </w:p>
     <w:p>
       <w:pPr>
-        <w:spacing w:line="300" w:lineRule="auto" w:after="60"/>
+        <w:spacing w:line="288" w:lineRule="auto" w:after="50"/>
         <w:jc w:val="both"/>
       </w:pPr>
       <w:r>
         <w:rPr>
           <w:rFonts w:ascii="Calibri" w:hAnsi="Calibri"/>
           <w:color w:val="28323C"/>
-          <w:sz w:val="22"/>
+          <w:sz w:val="21"/>
         </w:rPr>
         <w:t>1. Detección en Maps: El gestor abre la aplicación, selecciona su zona geográfica y filtra por negocios de servicios (ej. barberías o clínicas dentales).</w:t>
       </w:r>
     </w:p>
     <w:p>
       <w:pPr>
-        <w:spacing w:line="300" w:lineRule="auto" w:after="60"/>
+        <w:spacing w:line="288" w:lineRule="auto" w:after="50"/>
         <w:jc w:val="both"/>
       </w:pPr>
       <w:r>
         <w:rPr>
           <w:rFonts w:ascii="Calibri" w:hAnsi="Calibri"/>
           <w:color w:val="28323C"/>
-          <w:sz w:val="22"/>
+          <w:sz w:val="21"/>
         </w:rPr>
         <w:t>2. Diagnóstico de Carencias: El sistema analiza el local 'Barbería Clásica' y detecta que no tiene web ni reservas online (Score Digital del 45%).</w:t>
       </w:r>
     </w:p>
     <w:p>
       <w:pPr>
-        <w:spacing w:line="300" w:lineRule="auto" w:after="60"/>
+        <w:spacing w:line="288" w:lineRule="auto" w:after="50"/>
         <w:jc w:val="both"/>
       </w:pPr>
       <w:r>
         <w:rPr>
           <w:rFonts w:ascii="Calibri" w:hAnsi="Calibri"/>
           <w:color w:val="28323C"/>
-          <w:sz w:val="22"/>
+          <w:sz w:val="21"/>
         </w:rPr>
         <w:t>3. Generación Inmediata de la Solución: La IA analiza los datos de Maps (horarios, opiniones y fotos) y genera en 25 segundos una web completa con precios de cortes y un widget de reservas de citas.</w:t>
       </w:r>
     </w:p>
     <w:p>
       <w:pPr>
-        <w:spacing w:line="300" w:lineRule="auto" w:after="60"/>
+        <w:spacing w:line="288" w:lineRule="auto" w:after="50"/>
         <w:jc w:val="both"/>
       </w:pPr>
       <w:r>
         <w:rPr>
           <w:rFonts w:ascii="Calibri" w:hAnsi="Calibri"/>
           <w:color w:val="28323C"/>
-          <w:sz w:val="22"/>
+          <w:sz w:val="21"/>
         </w:rPr>
         <w:t>4. Presentación y Demostración: El comercial contacta con el dueño mostrando la web ya funcionando en el móvil: 'Hemos preparado esta demo para tu negocio; incluye tus citas y tu WhatsApp por una cuota reducida al mes'.</w:t>
       </w:r>
     </w:p>
     <w:p>
       <w:pPr>
-        <w:spacing w:line="300" w:lineRule="auto" w:after="60"/>
+        <w:spacing w:line="288" w:lineRule="auto" w:after="50"/>
         <w:jc w:val="both"/>
       </w:pPr>
       <w:r>
         <w:rPr>
           <w:rFonts w:ascii="Calibri" w:hAnsi="Calibri"/>
           <w:color w:val="28323C"/>
-          <w:sz w:val="22"/>
+          <w:sz w:val="21"/>
         </w:rPr>
         <w:t>5. Activación del Servicio: El comerciante contrata el servicio; recibe acceso a su panel de control de LeadCraft AI en su móvil para gestionar sus citas entrantes y su web queda publicada en Internet.</w:t>
       </w:r>
@@ -1183,41 +1289,41 @@
     <w:p>
       <w:pPr>
         <w:keepNext/>
-        <w:spacing w:before="120" w:after="40"/>
+        <w:spacing w:before="40" w:after="40"/>
       </w:pPr>
       <w:r>
         <w:rPr>
           <w:rFonts w:ascii="Calibri" w:hAnsi="Calibri"/>
           <w:b/>
           <w:color w:val="0A192F"/>
-          <w:sz w:val="26"/>
+          <w:sz w:val="25"/>
         </w:rPr>
         <w:t>11. Diagrama de Arquitectura del Sistema</w:t>
       </w:r>
     </w:p>
     <w:p>
       <w:pPr>
-        <w:spacing w:line="300" w:lineRule="auto" w:after="60"/>
+        <w:spacing w:line="288" w:lineRule="auto" w:after="40"/>
         <w:jc w:val="both"/>
       </w:pPr>
       <w:r>
         <w:rPr>
           <w:rFonts w:ascii="Calibri" w:hAnsi="Calibri"/>
           <w:color w:val="28323C"/>
-          <w:sz w:val="22"/>
+          <w:sz w:val="21"/>
         </w:rPr>
         <w:t>La arquitectura técnica de LeadCraft AI se estructura en cuatro capas modulares que separan el cliente, la lógica de negocio, las APIs externas y la persistencia de datos:</w:t>
       </w:r>
     </w:p>
     <w:p>
       <w:pPr>
-        <w:spacing w:before="40" w:after="40"/>
+        <w:spacing w:before="20" w:after="20"/>
         <w:jc w:val="center"/>
       </w:pPr>
       <w:r>
         <w:drawing>
           <wp:inline xmlns:a="http://schemas.openxmlformats.org/drawingml/2006/main" xmlns:pic="http://schemas.openxmlformats.org/drawingml/2006/picture">
-            <wp:extent cx="5303520" cy="3005328"/>
+            <wp:extent cx="5029200" cy="2849880"/>
             <wp:docPr id="1" name="Picture 1"/>
             <wp:cNvGraphicFramePr>
               <a:graphicFrameLocks noChangeAspect="1"/>
@@ -1238,7 +1344,7 @@
                   <pic:spPr>
                     <a:xfrm>
                       <a:off x="0" y="0"/>
-                      <a:ext cx="5303520" cy="3005328"/>
+                      <a:ext cx="5029200" cy="2849880"/>
                     </a:xfrm>
                     <a:prstGeom prst="rect"/>
                   </pic:spPr>
@@ -1251,7 +1357,7 @@
     </w:p>
     <w:p>
       <w:pPr>
-        <w:spacing w:after="120"/>
+        <w:spacing w:after="80"/>
         <w:jc w:val="center"/>
       </w:pPr>
       <w:r>
@@ -1259,7 +1365,7 @@
           <w:rFonts w:ascii="Calibri" w:hAnsi="Calibri"/>
           <w:i/>
           <w:color w:val="64748B"/>
-          <w:sz w:val="17"/>
+          <w:sz w:val="16"/>
         </w:rPr>
         <w:t>Figura 1: Arquitectura de Componentes de LeadCraft AI (Frontend, Backend Gateway, APIs Externas y Capa de Datos).</w:t>
       </w:r>
@@ -1267,14 +1373,14 @@
     <w:p>
       <w:pPr>
         <w:keepNext/>
-        <w:spacing w:before="80" w:after="40"/>
+        <w:spacing w:before="60" w:after="40"/>
       </w:pPr>
       <w:r>
         <w:rPr>
           <w:rFonts w:ascii="Calibri" w:hAnsi="Calibri"/>
           <w:b/>
           <w:color w:val="0A192F"/>
-          <w:sz w:val="26"/>
+          <w:sz w:val="25"/>
         </w:rPr>
         <w:t>12. Mockups de Pantallas Clave de la Aplicación</w:t>
       </w:r>
@@ -1287,22 +1393,23 @@
         <w:tblLook w:firstColumn="1" w:firstRow="1" w:lastColumn="0" w:lastRow="0" w:noHBand="0" w:noVBand="1" w:val="04A0"/>
       </w:tblPr>
       <w:tblGrid>
-        <w:gridCol w:w="4802"/>
-        <w:gridCol w:w="4802"/>
+        <w:gridCol w:w="4874"/>
+        <w:gridCol w:w="4874"/>
       </w:tblGrid>
       <w:tr>
         <w:tc>
           <w:tcPr>
-            <w:tcW w:type="dxa" w:w="4752"/>
+            <w:tcW w:type="dxa" w:w="4824"/>
           </w:tcPr>
           <w:p>
             <w:pPr>
+              <w:spacing w:before="20" w:after="20"/>
               <w:jc w:val="center"/>
             </w:pPr>
             <w:r>
               <w:drawing>
                 <wp:inline xmlns:a="http://schemas.openxmlformats.org/drawingml/2006/main" xmlns:pic="http://schemas.openxmlformats.org/drawingml/2006/picture">
-                  <wp:extent cx="2834640" cy="1582125"/>
+                  <wp:extent cx="2880360" cy="2097245"/>
                   <wp:docPr id="2" name="Picture 2"/>
                   <wp:cNvGraphicFramePr>
                     <a:graphicFrameLocks noChangeAspect="1"/>
@@ -1311,7 +1418,7 @@
                     <a:graphicData uri="http://schemas.openxmlformats.org/drawingml/2006/picture">
                       <pic:pic>
                         <pic:nvPicPr>
-                          <pic:cNvPr id="0" name="mockup_leadcraft_audit.jpg"/>
+                          <pic:cNvPr id="0" name="mockup_leadcraft_desktop.png"/>
                           <pic:cNvPicPr/>
                         </pic:nvPicPr>
                         <pic:blipFill>
@@ -1323,7 +1430,7 @@
                         <pic:spPr>
                           <a:xfrm>
                             <a:off x="0" y="0"/>
-                            <a:ext cx="2834640" cy="1582125"/>
+                            <a:ext cx="2880360" cy="2097245"/>
                           </a:xfrm>
                           <a:prstGeom prst="rect"/>
                         </pic:spPr>
@@ -1336,28 +1443,32 @@
           </w:p>
           <w:p>
             <w:pPr>
+              <w:spacing w:before="20" w:after="20"/>
               <w:jc w:val="center"/>
             </w:pPr>
             <w:r>
               <w:rPr>
+                <w:b/>
+                <w:color w:val="475569"/>
                 <w:sz w:val="16"/>
               </w:rPr>
-              <w:t>Pantalla 1: Mapa de Prospección y Auditoría Digital.</w:t>
+              <w:t>Pantalla 1: Mapa y Auditoría Digital Express versión Escritorio.</w:t>
             </w:r>
           </w:p>
         </w:tc>
         <w:tc>
           <w:tcPr>
-            <w:tcW w:type="dxa" w:w="4752"/>
+            <w:tcW w:type="dxa" w:w="4824"/>
           </w:tcPr>
           <w:p>
             <w:pPr>
+              <w:spacing w:before="20" w:after="20"/>
               <w:jc w:val="center"/>
             </w:pPr>
             <w:r>
               <w:drawing>
                 <wp:inline xmlns:a="http://schemas.openxmlformats.org/drawingml/2006/main" xmlns:pic="http://schemas.openxmlformats.org/drawingml/2006/picture">
-                  <wp:extent cx="2834640" cy="1582125"/>
+                  <wp:extent cx="2880360" cy="1608951"/>
                   <wp:docPr id="3" name="Picture 3"/>
                   <wp:cNvGraphicFramePr>
                     <a:graphicFrameLocks noChangeAspect="1"/>
@@ -1366,7 +1477,7 @@
                     <a:graphicData uri="http://schemas.openxmlformats.org/drawingml/2006/picture">
                       <pic:pic>
                         <pic:nvPicPr>
-                          <pic:cNvPr id="0" name="mockup_leadcraft_generator.jpg"/>
+                          <pic:cNvPr id="0" name="mockup_leadcraft_mobile.png"/>
                           <pic:cNvPicPr/>
                         </pic:nvPicPr>
                         <pic:blipFill>
@@ -1378,7 +1489,7 @@
                         <pic:spPr>
                           <a:xfrm>
                             <a:off x="0" y="0"/>
-                            <a:ext cx="2834640" cy="1582125"/>
+                            <a:ext cx="2880360" cy="1608951"/>
                           </a:xfrm>
                           <a:prstGeom prst="rect"/>
                         </pic:spPr>
@@ -1391,13 +1502,16 @@
           </w:p>
           <w:p>
             <w:pPr>
+              <w:spacing w:before="20" w:after="20"/>
               <w:jc w:val="center"/>
             </w:pPr>
             <w:r>
               <w:rPr>
+                <w:b/>
+                <w:color w:val="475569"/>
                 <w:sz w:val="16"/>
               </w:rPr>
-              <w:t>Pantalla 2: Servicio Web Activo con Citas y WhatsApp.</w:t>
+              <w:t>Pantalla 2: Versión móvil en 3 fases (Explorar, Generar y Exportar).</w:t>
             </w:r>
           </w:p>
         </w:tc>
@@ -1407,7 +1521,7 @@
       <w:headerReference w:type="default" r:id="rId9"/>
       <w:footerReference w:type="default" r:id="rId10"/>
       <w:pgSz w:w="11909" w:h="16834"/>
-      <w:pgMar w:top="1008" w:right="1152" w:bottom="1008" w:left="1152" w:header="720" w:footer="720" w:gutter="0"/>
+      <w:pgMar w:top="1008" w:right="1080" w:bottom="1008" w:left="1080" w:header="720" w:footer="720" w:gutter="0"/>
       <w:cols w:space="720"/>
       <w:titlePg/>
       <w:docGrid w:linePitch="360"/>
@@ -1427,7 +1541,7 @@
       <w:rPr>
         <w:rFonts w:ascii="Calibri" w:hAnsi="Calibri"/>
         <w:color w:val="78909C"/>
-        <w:sz w:val="18"/>
+        <w:sz w:val="17"/>
       </w:rPr>
       <w:t>LeadCraft AI  •  Kevin Muñoz Córcoles</w:t>
       <w:tab/>
@@ -1438,7 +1552,7 @@
       <w:rPr>
         <w:rFonts w:ascii="Calibri" w:hAnsi="Calibri"/>
         <w:color w:val="78909C"/>
-        <w:sz w:val="18"/>
+        <w:sz w:val="17"/>
       </w:rPr>
       <w:fldChar w:fldCharType="begin"/>
       <w:instrText xml:space="preserve"> PAGE </w:instrText>
@@ -1462,7 +1576,7 @@
         <w:color w:val="78909C"/>
         <w:sz w:val="17"/>
       </w:rPr>
-      <w:t>Proyecto Intermodular - 2º DAM  |  Hito 1: Viabilidad Inicial (LeadCraft AI)</w:t>
+      <w:t>Proyecto Intermodular - 2º DAM  |  Hito 1: LeadCraft AI</w:t>
     </w:r>
   </w:p>
 </w:hdr>
@@ -1832,12 +1946,12 @@
     <w:qFormat/>
     <w:rsid w:val="00FC693F"/>
     <w:pPr>
-      <w:spacing w:line="300" w:lineRule="auto" w:after="60"/>
+      <w:spacing w:line="288" w:lineRule="auto" w:after="50"/>
     </w:pPr>
     <w:rPr>
       <w:rFonts w:ascii="Calibri" w:hAnsi="Calibri"/>
       <w:color w:val="232F3E"/>
-      <w:sz w:val="22"/>
+      <w:sz w:val="21"/>
     </w:rPr>
   </w:style>
   <w:style w:type="paragraph" w:styleId="Header">

</xml_diff>